<commit_message>
Document that Aktif/Non-Aktif "semester ini" files must match semester
Clarifies something that was only implicit before: the "File Mahasiswa
Aktif" and "File Mahasiswa Non-Aktif" (semester ini) inputs are paired
into one semester by the year+term pattern detected from each file's
own name, not by selection order - so both must carry the same
Ganjil/Genap + tahun ajaran in their filename, or the tool silently
treats them as two separate semesters each missing half their data.
Added to the Panduan Pengguna (bagian 2.3) and the generate_sp_do.py
module docstring.

Co-Authored-By: Claude Sonnet 5 <noreply@anthropic.com>
</commit_message>
<xml_diff>
--- a/Panduan Pengguna SIMPRODI Desktop.docx
+++ b/Panduan Pengguna SIMPRODI Desktop.docx
@@ -1845,10 +1845,10 @@
     </w:p>
     <w:p>
       <w:r>
-        <w:t>Data mentah aktif/non-aktif/lulus (hasil export a</w:t>
-      </w:r>
-      <w:r>
-        <w:t>kademik: Nim, Nama, Program Studi, Ipk, Total Sks Lulus, dst) hanya diisi untuk SEMESTER YANG SEDANG DIPROSES - riwayat semester-semester sebelumnya cukup lewat folder rekap SP/DO.</w:t>
+        <w:t xml:space="preserve">Data mentah aktif/non-aktif/lulus (hasil export akademik: Nim, Nama, Program Studi, Ipk, Total Sks Lulus, dst) hanya diisi untuk SEMESTER YANG SEDANG DIPROSES - riwayat semester-semester sebelumnya cukup </w:t>
+      </w:r>
+      <w:r>
+        <w:t>lewat folder rekap SP/DO. File aktif dan non-aktif untuk semester ini harus semester yang sama satu sama lain (lihat langkah di bawah).</w:t>
       </w:r>
     </w:p>
     <w:p>
@@ -2191,7 +2191,7 @@
         <w:t>Untuk cara A/B: di "File Mahasiswa Aktif" dan "File Mahasiswa Non-Aktif", tambahkan file data SEMESTER YANG SEDANG DIPROSES s</w:t>
       </w:r>
       <w:r>
-        <w:t>aja (bukan riwayat lama).</w:t>
+        <w:t>aja (bukan riwayat lama) - KEDUANYA harus semester yang SAMA (mis. kalau mau proses Genap 2025-2026, isi file Aktif Genap 2025-2026 DAN Non-Aktif Genap 2025-2026, jangan beda semester), karena semesternya dideteksi otomatis dari nama file, bukan dari urutan dipilihnya.</w:t>
       </w:r>
     </w:p>
     <w:p>

</xml_diff>